<commit_message>
Use the supplied architecture diagram as Figure 1
The body is a two-column section and the diagram is twice as wide as it is
tall, so at column width its labels would be about 2pt. It goes in a
one-column island instead -- a continuous section break before and after,
the OOXML equivalent of figure* -- and runs the full 6.9in text width at the
top of the page, where the labels read at print size.

The caption is rewritten for this diagram: the previous one described the
drawing it replaces ("each box carries the sub-section of Section IV that
specifies it"), which is not true of this one. It keeps the pointers into
Sections IV-C, IV-D, IV-F and IV-G, and says that the classifier the diagram
labels generically is a CNN-BiLSTM in this work.

Co-Authored-By: Claude Opus 5 <noreply@anthropic.com>
Claude-Session: https://claude.ai/code/session_0141JxFrg82JvLGENztWSXA5
</commit_message>
<xml_diff>
--- a/paper/TwinShield-Fusion_IEEE_Access.docx
+++ b/paper/TwinShield-Fusion_IEEE_Access.docx
@@ -2932,43 +2932,44 @@
     </w:p>
     <w:p>
       <w:pPr>
-        <w:keepNext/>
-        <w:pBdr>
-          <w:top w:val="nil"/>
-          <w:left w:val="nil"/>
-          <w:bottom w:val="nil"/>
-          <w:right w:val="nil"/>
-          <w:between w:val="nil"/>
-        </w:pBdr>
-        <w:jc w:val="both"/>
-        <w:rPr>
-          <w:color w:val="000000"/>
-          <w:sz w:val="16"/>
-          <w:szCs w:val="16"/>
-        </w:rPr>
-      </w:pPr>
-      <w:r>
-        <w:rPr>
-          <w:noProof/>
-          <w:color w:val="000000"/>
-          <w:sz w:val="16"/>
-          <w:szCs w:val="16"/>
-        </w:rPr>
+        <w:rPr>
+          <w:sz w:val="2"/>
+          <w:szCs w:val="2"/>
+        </w:rPr>
+        <w:sectPr>
+          <w:headerReference w:type="default" r:id="rId12"/>
+          <w:footerReference w:type="default" r:id="rId13"/>
+          <w:type w:val="continuous"/>
+          <w:pgSz w:w="11520" w:h="15660"/>
+          <w:pgMar w:top="1300" w:right="740" w:bottom="1040" w:left="740" w:header="360" w:footer="640" w:gutter="0"/>
+          <w:cols w:num="2" w:space="720" w:equalWidth="0">
+            <w:col w:w="4820" w:space="400"/>
+            <w:col w:w="4820" w:space="0"/>
+          </w:cols>
+        </w:sectPr>
+      </w:pPr>
+    </w:p>
+    <w:p>
+      <w:pPr>
+        <w:spacing w:before="120" w:after="80"/>
+        <w:jc w:val="center"/>
+      </w:pPr>
+      <w:r>
         <w:drawing>
-          <wp:inline distT="0" distB="0" distL="0" distR="0" wp14:anchorId="6F629EA4" wp14:editId="356CECBE">
-            <wp:extent cx="2926080" cy="3081962"/>
+          <wp:inline distT="0" distB="0" distL="0" distR="0">
+            <wp:extent cx="6309360" cy="3154680"/>
             <wp:effectExtent l="0" t="0" r="0" b="0"/>
-            <wp:docPr id="2" name="image2.png"/>
+            <wp:docPr id="88" name="image8.png"/>
             <wp:cNvGraphicFramePr/>
             <a:graphic xmlns:a="http://schemas.openxmlformats.org/drawingml/2006/main">
               <a:graphicData uri="http://schemas.openxmlformats.org/drawingml/2006/picture">
                 <pic:pic xmlns:pic="http://schemas.openxmlformats.org/drawingml/2006/picture">
                   <pic:nvPicPr>
-                    <pic:cNvPr id="0" name="image2.png"/>
+                    <pic:cNvPr id="0" name="image8.png"/>
                     <pic:cNvPicPr preferRelativeResize="0"/>
                   </pic:nvPicPr>
                   <pic:blipFill>
-                    <a:blip r:embed="rId8"/>
+                    <a:blip r:embed="rId17"/>
                     <a:srcRect/>
                     <a:stretch>
                       <a:fillRect/>
@@ -2977,7 +2978,7 @@
                   <pic:spPr>
                     <a:xfrm>
                       <a:off x="0" y="0"/>
-                      <a:ext cx="2926080" cy="3081962"/>
+                      <a:ext cx="6309360" cy="3154680"/>
                     </a:xfrm>
                     <a:prstGeom prst="rect">
                       <a:avLst/>
@@ -3019,8 +3020,24 @@
           <w:sz w:val="14"/>
           <w:szCs w:val="14"/>
         </w:rPr>
-        <w:t xml:space="preserve">FIGURE 1.  TwinShield-Fusion. Each box carries the sub-section of Section IV that specifies it. The supervised branch (right) names attacks it recognises; the unsupervised branch (left) is fitted and calibrated on normal traffic alone, and is the path that responds to an attack carrying a label the model has never seen.</w:t>
-      </w:r>
+        <w:t xml:space="preserve">FIGURE 1.  TwinShield-Fusion. Raw CAN traffic is preprocessed once and read by two branches. The digital twin predicts the next payload of each arbitration identifier from normal traffic alone, and its prediction residual is standardised per identifier and per byte and thresholded at a calibrated false-positive rate (Sections IV-C and IV-F). The supervised classifier, a CNN-BiLSTM in this work, names the attacks it was trained on (Section IV-D). The residual anomaly gate combines the two scores, which is what lets an attack with no label of its own still raise an alarm (Section IV-G).</w:t>
+      </w:r>
+    </w:p>
+    <w:p>
+      <w:pPr>
+        <w:rPr>
+          <w:sz w:val="2"/>
+          <w:szCs w:val="2"/>
+        </w:rPr>
+        <w:sectPr>
+          <w:headerReference w:type="default" r:id="rId12"/>
+          <w:footerReference w:type="default" r:id="rId13"/>
+          <w:type w:val="continuous"/>
+          <w:pgSz w:w="11520" w:h="15660"/>
+          <w:pgMar w:top="1300" w:right="740" w:bottom="1040" w:left="740" w:header="360" w:footer="640" w:gutter="0"/>
+          <w:cols w:space="720"/>
+        </w:sectPr>
+      </w:pPr>
     </w:p>
     <w:p>
       <w:pPr>

</xml_diff>